<commit_message>
keywords.csv BOM修正 + 起案共通docx更新
</commit_message>
<xml_diff>
--- a/01_kanri-flow_起案_共通.docx
+++ b/01_kanri-flow_起案_共通.docx
@@ -3359,22 +3359,11 @@
             <w:r>
               <w:rPr>
                 <w:rFonts w:hint="eastAsia"/>
-                <w:spacing w:val="9"/>
-                <w:sz w:val="21"/>
-                <w:szCs w:val="21"/>
-                <w:fitText w:val="1365" w:id="1139469060"/>
-              </w:rPr>
-              <w:t>{{所属部署}</w:t>
-            </w:r>
-            <w:r>
-              <w:rPr>
-                <w:rFonts w:hint="eastAsia"/>
-                <w:spacing w:val="7"/>
-                <w:sz w:val="21"/>
-                <w:szCs w:val="21"/>
-                <w:fitText w:val="1365" w:id="1139469060"/>
-              </w:rPr>
-              <w:t>}</w:t>
+                <w:spacing w:val="0"/>
+                <w:sz w:val="21"/>
+                <w:szCs w:val="21"/>
+              </w:rPr>
+              <w:t>{{所属部署}}</w:t>
             </w:r>
             <w:r>
               <w:rPr>

</xml_diff>